<commit_message>
conpleted the v1 of applicant tracking and ranking system
</commit_message>
<xml_diff>
--- a/Data/Resumes/resume_14.docx
+++ b/Data/Resumes/resume_14.docx
@@ -1,6 +1,6 @@
 
 <file path=word/document.xml><?xml version="1.0" encoding="utf-8"?>
-<w:document xmlns:wpc="http://schemas.microsoft.com/office/word/2010/wordprocessingCanvas" xmlns:cx="http://schemas.microsoft.com/office/drawing/2014/chartex" xmlns:cx1="http://schemas.microsoft.com/office/drawing/2015/9/8/chartex" xmlns:cx2="http://schemas.microsoft.com/office/drawing/2015/10/21/chartex" xmlns:cx3="http://schemas.microsoft.com/office/drawing/2016/5/9/chartex" xmlns:cx4="http://schemas.microsoft.com/office/drawing/2016/5/10/chartex" xmlns:cx5="http://schemas.microsoft.com/office/drawing/2016/5/11/chartex" xmlns:cx6="http://schemas.microsoft.com/office/drawing/2016/5/12/chartex" xmlns:cx7="http://schemas.microsoft.com/office/drawing/2016/5/13/chartex" xmlns:cx8="http://schemas.microsoft.com/office/drawing/2016/5/14/chartex" xmlns:mc="http://schemas.openxmlformats.org/markup-compatibility/2006" xmlns:aink="http://schemas.microsoft.com/office/drawing/2016/ink" xmlns:am3d="http://schemas.microsoft.com/office/drawing/2017/model3d" xmlns:o="urn:schemas-microsoft-com:office:office" xmlns:r="http://schemas.openxmlformats.org/officeDocument/2006/relationships" xmlns:m="http://schemas.openxmlformats.org/officeDocument/2006/math" xmlns:v="urn:schemas-microsoft-com:vml" xmlns:wp14="http://schemas.microsoft.com/office/word/2010/wordprocessingDrawing" xmlns:wp="http://schemas.openxmlformats.org/drawingml/2006/wordprocessingDrawing" xmlns:w10="urn:schemas-microsoft-com:office:word" xmlns:w="http://schemas.openxmlformats.org/wordprocessingml/2006/main" xmlns:w14="http://schemas.microsoft.com/office/word/2010/wordml" xmlns:w15="http://schemas.microsoft.com/office/word/2012/wordml" xmlns:w16cex="http://schemas.microsoft.com/office/word/2018/wordml/cex" xmlns:w16cid="http://schemas.microsoft.com/office/word/2016/wordml/cid" xmlns:w16="http://schemas.microsoft.com/office/word/2018/wordml" xmlns:w16sdtdh="http://schemas.microsoft.com/office/word/2020/wordml/sdtdatahash" xmlns:w16se="http://schemas.microsoft.com/office/word/2015/wordml/symex" xmlns:wpg="http://schemas.microsoft.com/office/word/2010/wordprocessingGroup" xmlns:wpi="http://schemas.microsoft.com/office/word/2010/wordprocessingInk" xmlns:wne="http://schemas.microsoft.com/office/word/2006/wordml" xmlns:wps="http://schemas.microsoft.com/office/word/2010/wordprocessingShape" mc:Ignorable="w14 w15 w16se w16cid w16 w16cex w16sdtdh wp14">
+<w:document xmlns:wpc="http://schemas.microsoft.com/office/word/2010/wordprocessingCanvas" xmlns:cx="http://schemas.microsoft.com/office/drawing/2014/chartex" xmlns:cx1="http://schemas.microsoft.com/office/drawing/2015/9/8/chartex" xmlns:cx2="http://schemas.microsoft.com/office/drawing/2015/10/21/chartex" xmlns:cx3="http://schemas.microsoft.com/office/drawing/2016/5/9/chartex" xmlns:cx4="http://schemas.microsoft.com/office/drawing/2016/5/10/chartex" xmlns:cx5="http://schemas.microsoft.com/office/drawing/2016/5/11/chartex" xmlns:cx6="http://schemas.microsoft.com/office/drawing/2016/5/12/chartex" xmlns:cx7="http://schemas.microsoft.com/office/drawing/2016/5/13/chartex" xmlns:cx8="http://schemas.microsoft.com/office/drawing/2016/5/14/chartex" xmlns:mc="http://schemas.openxmlformats.org/markup-compatibility/2006" xmlns:aink="http://schemas.microsoft.com/office/drawing/2016/ink" xmlns:am3d="http://schemas.microsoft.com/office/drawing/2017/model3d" xmlns:o="urn:schemas-microsoft-com:office:office" xmlns:oel="http://schemas.microsoft.com/office/2019/extlst" xmlns:r="http://schemas.openxmlformats.org/officeDocument/2006/relationships" xmlns:m="http://schemas.openxmlformats.org/officeDocument/2006/math" xmlns:v="urn:schemas-microsoft-com:vml" xmlns:wp14="http://schemas.microsoft.com/office/word/2010/wordprocessingDrawing" xmlns:wp="http://schemas.openxmlformats.org/drawingml/2006/wordprocessingDrawing" xmlns:w10="urn:schemas-microsoft-com:office:word" xmlns:w="http://schemas.openxmlformats.org/wordprocessingml/2006/main" xmlns:w14="http://schemas.microsoft.com/office/word/2010/wordml" xmlns:w15="http://schemas.microsoft.com/office/word/2012/wordml" xmlns:w16cex="http://schemas.microsoft.com/office/word/2018/wordml/cex" xmlns:w16cid="http://schemas.microsoft.com/office/word/2016/wordml/cid" xmlns:w16="http://schemas.microsoft.com/office/word/2018/wordml" xmlns:w16du="http://schemas.microsoft.com/office/word/2023/wordml/word16du" xmlns:w16sdtdh="http://schemas.microsoft.com/office/word/2020/wordml/sdtdatahash" xmlns:w16sdtfl="http://schemas.microsoft.com/office/word/2024/wordml/sdtformatlock" xmlns:w16se="http://schemas.microsoft.com/office/word/2015/wordml/symex" xmlns:wpg="http://schemas.microsoft.com/office/word/2010/wordprocessingGroup" xmlns:wpi="http://schemas.microsoft.com/office/word/2010/wordprocessingInk" xmlns:wne="http://schemas.microsoft.com/office/word/2006/wordml" xmlns:wps="http://schemas.microsoft.com/office/word/2010/wordprocessingShape" mc:Ignorable="w14 w15 w16se w16cid w16 w16cex w16sdtdh w16sdtfl w16du wp14">
   <w:body>
     <w:p>
       <w:pPr>
@@ -245,7 +245,7 @@
               </wp:anchor>
             </w:drawing>
           </mc:Choice>
-          <mc:Fallback xmlns:mv="urn:schemas-microsoft-com:mac:vml" xmlns:mo="http://schemas.microsoft.com/office/mac/office/2008/main">
+          <mc:Fallback xmlns:mo="http://schemas.microsoft.com/office/mac/office/2008/main" xmlns:mv="urn:schemas-microsoft-com:mac:vml">
             <w:pict>
               <v:line w14:anchorId="2E23F794" id="Line_x0020_2" o:spid="_x0000_s1026" style="position:absolute;z-index:251658240;visibility:visible;mso-wrap-style:square;mso-width-percent:0;mso-height-percent:0;mso-wrap-distance-left:9pt;mso-wrap-distance-top:0;mso-wrap-distance-right:9pt;mso-wrap-distance-bottom:0;mso-position-horizontal:absolute;mso-position-horizontal-relative:text;mso-position-vertical:absolute;mso-position-vertical-relative:text;mso-width-percent:0;mso-height-percent:0;mso-width-relative:page;mso-height-relative:page" from="17.65pt,7.25pt" to="525.5pt,7.25pt" o:gfxdata="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"/>
             </w:pict>
@@ -1052,196 +1052,6 @@
         </w:rPr>
         <w:t>Bachelor of Science in Information Systems, June 2008</w:t>
       </w:r>
-    </w:p>
-    <w:p>
-      <w:pPr>
-        <w:pStyle w:val="Body"/>
-        <w:numPr>
-          <w:ilvl w:val="0"/>
-          <w:numId w:val="1"/>
-        </w:numPr>
-        <w:spacing w:after="40"/>
-        <w:rPr>
-          <w:rFonts w:ascii="Georgia" w:hAnsi="Georgia" w:cs="Courier New"/>
-          <w:sz w:val="24"/>
-          <w:szCs w:val="24"/>
-        </w:rPr>
-      </w:pPr>
-      <w:r>
-        <w:rPr>
-          <w:rFonts w:ascii="Georgia" w:hAnsi="Georgia" w:cs="Courier New"/>
-          <w:sz w:val="24"/>
-          <w:szCs w:val="24"/>
-        </w:rPr>
-        <w:lastRenderedPageBreak/>
-        <w:t>Graduated Summa Cum Laude</w:t>
-      </w:r>
-    </w:p>
-    <w:p>
-      <w:pPr>
-        <w:pStyle w:val="Body"/>
-        <w:spacing w:after="40"/>
-        <w:rPr>
-          <w:rFonts w:ascii="Georgia" w:hAnsi="Georgia" w:cs="Courier New"/>
-          <w:sz w:val="24"/>
-          <w:szCs w:val="24"/>
-        </w:rPr>
-      </w:pPr>
-    </w:p>
-    <w:p>
-      <w:pPr>
-        <w:pStyle w:val="ListParagraph"/>
-        <w:tabs>
-          <w:tab w:val="left" w:pos="4760"/>
-        </w:tabs>
-        <w:rPr>
-          <w:sz w:val="28"/>
-          <w:szCs w:val="28"/>
-          <w:lang w:eastAsia="en-US"/>
-        </w:rPr>
-      </w:pPr>
-      <w:r>
-        <w:rPr>
-          <w:sz w:val="28"/>
-          <w:szCs w:val="28"/>
-        </w:rPr>
-        <w:t>Dear Job Seeker,</w:t>
-      </w:r>
-    </w:p>
-    <w:p>
-      <w:pPr>
-        <w:pStyle w:val="ListParagraph"/>
-        <w:tabs>
-          <w:tab w:val="left" w:pos="4760"/>
-        </w:tabs>
-        <w:rPr>
-          <w:sz w:val="28"/>
-          <w:szCs w:val="28"/>
-        </w:rPr>
-      </w:pPr>
-    </w:p>
-    <w:p>
-      <w:pPr>
-        <w:pStyle w:val="ListParagraph"/>
-        <w:tabs>
-          <w:tab w:val="left" w:pos="4760"/>
-        </w:tabs>
-        <w:rPr>
-          <w:sz w:val="28"/>
-          <w:szCs w:val="28"/>
-        </w:rPr>
-      </w:pPr>
-    </w:p>
-    <w:p>
-      <w:pPr>
-        <w:pStyle w:val="ListParagraph"/>
-        <w:rPr>
-          <w:sz w:val="28"/>
-          <w:szCs w:val="28"/>
-        </w:rPr>
-      </w:pPr>
-      <w:bookmarkStart w:id="0" w:name="OLE_LINK3"/>
-      <w:bookmarkStart w:id="1" w:name="OLE_LINK4"/>
-      <w:r>
-        <w:rPr>
-          <w:sz w:val="28"/>
-          <w:szCs w:val="28"/>
-        </w:rPr>
-        <w:t xml:space="preserve">If you’re struggling to write your resume, </w:t>
-      </w:r>
-      <w:r>
-        <w:rPr>
-          <w:b/>
-          <w:sz w:val="28"/>
-          <w:szCs w:val="28"/>
-        </w:rPr>
-        <w:t>don’t worry.</w:t>
-      </w:r>
-      <w:r>
-        <w:rPr>
-          <w:sz w:val="28"/>
-          <w:szCs w:val="28"/>
-        </w:rPr>
-        <w:t xml:space="preserve"> You’re in good company – everyone struggles with it. </w:t>
-      </w:r>
-      <w:bookmarkEnd w:id="0"/>
-      <w:bookmarkEnd w:id="1"/>
-    </w:p>
-    <w:p>
-      <w:pPr>
-        <w:ind w:left="360"/>
-        <w:rPr>
-          <w:sz w:val="28"/>
-          <w:szCs w:val="28"/>
-        </w:rPr>
-      </w:pPr>
-    </w:p>
-    <w:p>
-      <w:pPr>
-        <w:pStyle w:val="ListParagraph"/>
-        <w:rPr>
-          <w:sz w:val="40"/>
-          <w:szCs w:val="40"/>
-        </w:rPr>
-      </w:pPr>
-      <w:r>
-        <w:rPr>
-          <w:sz w:val="40"/>
-          <w:szCs w:val="40"/>
-        </w:rPr>
-        <w:t xml:space="preserve">Hire one of our certified professional resume writers from $49.95 per resume. </w:t>
-      </w:r>
-    </w:p>
-    <w:p>
-      <w:pPr>
-        <w:pStyle w:val="ListParagraph"/>
-        <w:rPr>
-          <w:sz w:val="28"/>
-          <w:szCs w:val="28"/>
-        </w:rPr>
-      </w:pPr>
-    </w:p>
-    <w:p>
-      <w:pPr>
-        <w:pStyle w:val="ListParagraph"/>
-        <w:rPr>
-          <w:sz w:val="32"/>
-          <w:szCs w:val="32"/>
-        </w:rPr>
-      </w:pPr>
-      <w:hyperlink r:id="rId7" w:history="1">
-        <w:r>
-          <w:rPr>
-            <w:rStyle w:val="Hyperlink"/>
-            <w:sz w:val="32"/>
-            <w:szCs w:val="32"/>
-          </w:rPr>
-          <w:t>https://app.resumethatworks.com/order.php.</w:t>
-        </w:r>
-      </w:hyperlink>
-    </w:p>
-    <w:p>
-      <w:pPr>
-        <w:pStyle w:val="NormalWeb"/>
-        <w:spacing w:before="0" w:beforeAutospacing="0" w:after="0" w:afterAutospacing="0"/>
-        <w:rPr>
-          <w:rFonts w:ascii="Arial" w:hAnsi="Arial" w:cs="Arial"/>
-          <w:color w:val="000000"/>
-          <w:sz w:val="22"/>
-          <w:szCs w:val="22"/>
-        </w:rPr>
-      </w:pPr>
-    </w:p>
-    <w:p>
-      <w:pPr>
-        <w:pStyle w:val="Body"/>
-        <w:spacing w:after="40"/>
-        <w:rPr>
-          <w:rFonts w:ascii="Georgia" w:hAnsi="Georgia" w:cs="Courier New"/>
-          <w:sz w:val="24"/>
-          <w:szCs w:val="24"/>
-        </w:rPr>
-      </w:pPr>
     </w:p>
     <w:sectPr>
       <w:pgSz w:w="12240" w:h="15840"/>
@@ -1254,7 +1064,7 @@
 </file>
 
 <file path=word/endnotes.xml><?xml version="1.0" encoding="utf-8"?>
-<w:endnotes xmlns:wpc="http://schemas.microsoft.com/office/word/2010/wordprocessingCanvas" xmlns:cx="http://schemas.microsoft.com/office/drawing/2014/chartex" xmlns:cx1="http://schemas.microsoft.com/office/drawing/2015/9/8/chartex" xmlns:cx2="http://schemas.microsoft.com/office/drawing/2015/10/21/chartex" xmlns:cx3="http://schemas.microsoft.com/office/drawing/2016/5/9/chartex" xmlns:cx4="http://schemas.microsoft.com/office/drawing/2016/5/10/chartex" xmlns:cx5="http://schemas.microsoft.com/office/drawing/2016/5/11/chartex" xmlns:cx6="http://schemas.microsoft.com/office/drawing/2016/5/12/chartex" xmlns:cx7="http://schemas.microsoft.com/office/drawing/2016/5/13/chartex" xmlns:cx8="http://schemas.microsoft.com/office/drawing/2016/5/14/chartex" xmlns:mc="http://schemas.openxmlformats.org/markup-compatibility/2006" xmlns:aink="http://schemas.microsoft.com/office/drawing/2016/ink" xmlns:am3d="http://schemas.microsoft.com/office/drawing/2017/model3d" xmlns:o="urn:schemas-microsoft-com:office:office" xmlns:r="http://schemas.openxmlformats.org/officeDocument/2006/relationships" xmlns:m="http://schemas.openxmlformats.org/officeDocument/2006/math" xmlns:v="urn:schemas-microsoft-com:vml" xmlns:wp14="http://schemas.microsoft.com/office/word/2010/wordprocessingDrawing" xmlns:wp="http://schemas.openxmlformats.org/drawingml/2006/wordprocessingDrawing" xmlns:w10="urn:schemas-microsoft-com:office:word" xmlns:w="http://schemas.openxmlformats.org/wordprocessingml/2006/main" xmlns:w14="http://schemas.microsoft.com/office/word/2010/wordml" xmlns:w15="http://schemas.microsoft.com/office/word/2012/wordml" xmlns:w16cex="http://schemas.microsoft.com/office/word/2018/wordml/cex" xmlns:w16cid="http://schemas.microsoft.com/office/word/2016/wordml/cid" xmlns:w16="http://schemas.microsoft.com/office/word/2018/wordml" xmlns:w16sdtdh="http://schemas.microsoft.com/office/word/2020/wordml/sdtdatahash" xmlns:w16se="http://schemas.microsoft.com/office/word/2015/wordml/symex" xmlns:wpg="http://schemas.microsoft.com/office/word/2010/wordprocessingGroup" xmlns:wpi="http://schemas.microsoft.com/office/word/2010/wordprocessingInk" xmlns:wne="http://schemas.microsoft.com/office/word/2006/wordml" xmlns:wps="http://schemas.microsoft.com/office/word/2010/wordprocessingShape" mc:Ignorable="w14 w15 w16se w16cid w16 w16cex w16sdtdh wp14">
+<w:endnotes xmlns:wpc="http://schemas.microsoft.com/office/word/2010/wordprocessingCanvas" xmlns:cx="http://schemas.microsoft.com/office/drawing/2014/chartex" xmlns:cx1="http://schemas.microsoft.com/office/drawing/2015/9/8/chartex" xmlns:cx2="http://schemas.microsoft.com/office/drawing/2015/10/21/chartex" xmlns:cx3="http://schemas.microsoft.com/office/drawing/2016/5/9/chartex" xmlns:cx4="http://schemas.microsoft.com/office/drawing/2016/5/10/chartex" xmlns:cx5="http://schemas.microsoft.com/office/drawing/2016/5/11/chartex" xmlns:cx6="http://schemas.microsoft.com/office/drawing/2016/5/12/chartex" xmlns:cx7="http://schemas.microsoft.com/office/drawing/2016/5/13/chartex" xmlns:cx8="http://schemas.microsoft.com/office/drawing/2016/5/14/chartex" xmlns:mc="http://schemas.openxmlformats.org/markup-compatibility/2006" xmlns:aink="http://schemas.microsoft.com/office/drawing/2016/ink" xmlns:am3d="http://schemas.microsoft.com/office/drawing/2017/model3d" xmlns:o="urn:schemas-microsoft-com:office:office" xmlns:oel="http://schemas.microsoft.com/office/2019/extlst" xmlns:r="http://schemas.openxmlformats.org/officeDocument/2006/relationships" xmlns:m="http://schemas.openxmlformats.org/officeDocument/2006/math" xmlns:v="urn:schemas-microsoft-com:vml" xmlns:wp14="http://schemas.microsoft.com/office/word/2010/wordprocessingDrawing" xmlns:wp="http://schemas.openxmlformats.org/drawingml/2006/wordprocessingDrawing" xmlns:w10="urn:schemas-microsoft-com:office:word" xmlns:w="http://schemas.openxmlformats.org/wordprocessingml/2006/main" xmlns:w14="http://schemas.microsoft.com/office/word/2010/wordml" xmlns:w15="http://schemas.microsoft.com/office/word/2012/wordml" xmlns:w16cex="http://schemas.microsoft.com/office/word/2018/wordml/cex" xmlns:w16cid="http://schemas.microsoft.com/office/word/2016/wordml/cid" xmlns:w16="http://schemas.microsoft.com/office/word/2018/wordml" xmlns:w16du="http://schemas.microsoft.com/office/word/2023/wordml/word16du" xmlns:w16sdtdh="http://schemas.microsoft.com/office/word/2020/wordml/sdtdatahash" xmlns:w16sdtfl="http://schemas.microsoft.com/office/word/2024/wordml/sdtformatlock" xmlns:w16se="http://schemas.microsoft.com/office/word/2015/wordml/symex" xmlns:wpg="http://schemas.microsoft.com/office/word/2010/wordprocessingGroup" xmlns:wpi="http://schemas.microsoft.com/office/word/2010/wordprocessingInk" xmlns:wne="http://schemas.microsoft.com/office/word/2006/wordml" xmlns:wps="http://schemas.microsoft.com/office/word/2010/wordprocessingShape" mc:Ignorable="w14 w15 w16se w16cid w16 w16cex w16sdtdh w16sdtfl w16du wp14">
   <w:endnote w:type="separator" w:id="-1">
     <w:p>
       <w:r>
@@ -1273,7 +1083,7 @@
 </file>
 
 <file path=word/footnotes.xml><?xml version="1.0" encoding="utf-8"?>
-<w:footnotes xmlns:wpc="http://schemas.microsoft.com/office/word/2010/wordprocessingCanvas" xmlns:cx="http://schemas.microsoft.com/office/drawing/2014/chartex" xmlns:cx1="http://schemas.microsoft.com/office/drawing/2015/9/8/chartex" xmlns:cx2="http://schemas.microsoft.com/office/drawing/2015/10/21/chartex" xmlns:cx3="http://schemas.microsoft.com/office/drawing/2016/5/9/chartex" xmlns:cx4="http://schemas.microsoft.com/office/drawing/2016/5/10/chartex" xmlns:cx5="http://schemas.microsoft.com/office/drawing/2016/5/11/chartex" xmlns:cx6="http://schemas.microsoft.com/office/drawing/2016/5/12/chartex" xmlns:cx7="http://schemas.microsoft.com/office/drawing/2016/5/13/chartex" xmlns:cx8="http://schemas.microsoft.com/office/drawing/2016/5/14/chartex" xmlns:mc="http://schemas.openxmlformats.org/markup-compatibility/2006" xmlns:aink="http://schemas.microsoft.com/office/drawing/2016/ink" xmlns:am3d="http://schemas.microsoft.com/office/drawing/2017/model3d" xmlns:o="urn:schemas-microsoft-com:office:office" xmlns:r="http://schemas.openxmlformats.org/officeDocument/2006/relationships" xmlns:m="http://schemas.openxmlformats.org/officeDocument/2006/math" xmlns:v="urn:schemas-microsoft-com:vml" xmlns:wp14="http://schemas.microsoft.com/office/word/2010/wordprocessingDrawing" xmlns:wp="http://schemas.openxmlformats.org/drawingml/2006/wordprocessingDrawing" xmlns:w10="urn:schemas-microsoft-com:office:word" xmlns:w="http://schemas.openxmlformats.org/wordprocessingml/2006/main" xmlns:w14="http://schemas.microsoft.com/office/word/2010/wordml" xmlns:w15="http://schemas.microsoft.com/office/word/2012/wordml" xmlns:w16cex="http://schemas.microsoft.com/office/word/2018/wordml/cex" xmlns:w16cid="http://schemas.microsoft.com/office/word/2016/wordml/cid" xmlns:w16="http://schemas.microsoft.com/office/word/2018/wordml" xmlns:w16sdtdh="http://schemas.microsoft.com/office/word/2020/wordml/sdtdatahash" xmlns:w16se="http://schemas.microsoft.com/office/word/2015/wordml/symex" xmlns:wpg="http://schemas.microsoft.com/office/word/2010/wordprocessingGroup" xmlns:wpi="http://schemas.microsoft.com/office/word/2010/wordprocessingInk" xmlns:wne="http://schemas.microsoft.com/office/word/2006/wordml" xmlns:wps="http://schemas.microsoft.com/office/word/2010/wordprocessingShape" mc:Ignorable="w14 w15 w16se w16cid w16 w16cex w16sdtdh wp14">
+<w:footnotes xmlns:wpc="http://schemas.microsoft.com/office/word/2010/wordprocessingCanvas" xmlns:cx="http://schemas.microsoft.com/office/drawing/2014/chartex" xmlns:cx1="http://schemas.microsoft.com/office/drawing/2015/9/8/chartex" xmlns:cx2="http://schemas.microsoft.com/office/drawing/2015/10/21/chartex" xmlns:cx3="http://schemas.microsoft.com/office/drawing/2016/5/9/chartex" xmlns:cx4="http://schemas.microsoft.com/office/drawing/2016/5/10/chartex" xmlns:cx5="http://schemas.microsoft.com/office/drawing/2016/5/11/chartex" xmlns:cx6="http://schemas.microsoft.com/office/drawing/2016/5/12/chartex" xmlns:cx7="http://schemas.microsoft.com/office/drawing/2016/5/13/chartex" xmlns:cx8="http://schemas.microsoft.com/office/drawing/2016/5/14/chartex" xmlns:mc="http://schemas.openxmlformats.org/markup-compatibility/2006" xmlns:aink="http://schemas.microsoft.com/office/drawing/2016/ink" xmlns:am3d="http://schemas.microsoft.com/office/drawing/2017/model3d" xmlns:o="urn:schemas-microsoft-com:office:office" xmlns:oel="http://schemas.microsoft.com/office/2019/extlst" xmlns:r="http://schemas.openxmlformats.org/officeDocument/2006/relationships" xmlns:m="http://schemas.openxmlformats.org/officeDocument/2006/math" xmlns:v="urn:schemas-microsoft-com:vml" xmlns:wp14="http://schemas.microsoft.com/office/word/2010/wordprocessingDrawing" xmlns:wp="http://schemas.openxmlformats.org/drawingml/2006/wordprocessingDrawing" xmlns:w10="urn:schemas-microsoft-com:office:word" xmlns:w="http://schemas.openxmlformats.org/wordprocessingml/2006/main" xmlns:w14="http://schemas.microsoft.com/office/word/2010/wordml" xmlns:w15="http://schemas.microsoft.com/office/word/2012/wordml" xmlns:w16cex="http://schemas.microsoft.com/office/word/2018/wordml/cex" xmlns:w16cid="http://schemas.microsoft.com/office/word/2016/wordml/cid" xmlns:w16="http://schemas.microsoft.com/office/word/2018/wordml" xmlns:w16du="http://schemas.microsoft.com/office/word/2023/wordml/word16du" xmlns:w16sdtdh="http://schemas.microsoft.com/office/word/2020/wordml/sdtdatahash" xmlns:w16sdtfl="http://schemas.microsoft.com/office/word/2024/wordml/sdtformatlock" xmlns:w16se="http://schemas.microsoft.com/office/word/2015/wordml/symex" xmlns:wpg="http://schemas.microsoft.com/office/word/2010/wordprocessingGroup" xmlns:wpi="http://schemas.microsoft.com/office/word/2010/wordprocessingInk" xmlns:wne="http://schemas.microsoft.com/office/word/2006/wordml" xmlns:wps="http://schemas.microsoft.com/office/word/2010/wordprocessingShape" mc:Ignorable="w14 w15 w16se w16cid w16 w16cex w16sdtdh w16sdtfl w16du wp14">
   <w:footnote w:type="separator" w:id="-1">
     <w:p>
       <w:r>
@@ -1292,7 +1102,7 @@
 </file>
 
 <file path=word/numbering.xml><?xml version="1.0" encoding="utf-8"?>
-<w:numbering xmlns:wpc="http://schemas.microsoft.com/office/word/2010/wordprocessingCanvas" xmlns:cx="http://schemas.microsoft.com/office/drawing/2014/chartex" xmlns:cx1="http://schemas.microsoft.com/office/drawing/2015/9/8/chartex" xmlns:cx2="http://schemas.microsoft.com/office/drawing/2015/10/21/chartex" xmlns:cx3="http://schemas.microsoft.com/office/drawing/2016/5/9/chartex" xmlns:cx4="http://schemas.microsoft.com/office/drawing/2016/5/10/chartex" xmlns:cx5="http://schemas.microsoft.com/office/drawing/2016/5/11/chartex" xmlns:cx6="http://schemas.microsoft.com/office/drawing/2016/5/12/chartex" xmlns:cx7="http://schemas.microsoft.com/office/drawing/2016/5/13/chartex" xmlns:cx8="http://schemas.microsoft.com/office/drawing/2016/5/14/chartex" xmlns:mc="http://schemas.openxmlformats.org/markup-compatibility/2006" xmlns:aink="http://schemas.microsoft.com/office/drawing/2016/ink" xmlns:am3d="http://schemas.microsoft.com/office/drawing/2017/model3d" xmlns:o="urn:schemas-microsoft-com:office:office" xmlns:r="http://schemas.openxmlformats.org/officeDocument/2006/relationships" xmlns:m="http://schemas.openxmlformats.org/officeDocument/2006/math" xmlns:v="urn:schemas-microsoft-com:vml" xmlns:wp14="http://schemas.microsoft.com/office/word/2010/wordprocessingDrawing" xmlns:wp="http://schemas.openxmlformats.org/drawingml/2006/wordprocessingDrawing" xmlns:w10="urn:schemas-microsoft-com:office:word" xmlns:w="http://schemas.openxmlformats.org/wordprocessingml/2006/main" xmlns:w14="http://schemas.microsoft.com/office/word/2010/wordml" xmlns:w15="http://schemas.microsoft.com/office/word/2012/wordml" xmlns:w16cex="http://schemas.microsoft.com/office/word/2018/wordml/cex" xmlns:w16cid="http://schemas.microsoft.com/office/word/2016/wordml/cid" xmlns:w16="http://schemas.microsoft.com/office/word/2018/wordml" xmlns:w16sdtdh="http://schemas.microsoft.com/office/word/2020/wordml/sdtdatahash" xmlns:w16se="http://schemas.microsoft.com/office/word/2015/wordml/symex" xmlns:wpg="http://schemas.microsoft.com/office/word/2010/wordprocessingGroup" xmlns:wpi="http://schemas.microsoft.com/office/word/2010/wordprocessingInk" xmlns:wne="http://schemas.microsoft.com/office/word/2006/wordml" xmlns:wps="http://schemas.microsoft.com/office/word/2010/wordprocessingShape" mc:Ignorable="w14 w15 w16se w16cid w16 w16cex w16sdtdh wp14">
+<w:numbering xmlns:wpc="http://schemas.microsoft.com/office/word/2010/wordprocessingCanvas" xmlns:cx="http://schemas.microsoft.com/office/drawing/2014/chartex" xmlns:cx1="http://schemas.microsoft.com/office/drawing/2015/9/8/chartex" xmlns:cx2="http://schemas.microsoft.com/office/drawing/2015/10/21/chartex" xmlns:cx3="http://schemas.microsoft.com/office/drawing/2016/5/9/chartex" xmlns:cx4="http://schemas.microsoft.com/office/drawing/2016/5/10/chartex" xmlns:cx5="http://schemas.microsoft.com/office/drawing/2016/5/11/chartex" xmlns:cx6="http://schemas.microsoft.com/office/drawing/2016/5/12/chartex" xmlns:cx7="http://schemas.microsoft.com/office/drawing/2016/5/13/chartex" xmlns:cx8="http://schemas.microsoft.com/office/drawing/2016/5/14/chartex" xmlns:mc="http://schemas.openxmlformats.org/markup-compatibility/2006" xmlns:aink="http://schemas.microsoft.com/office/drawing/2016/ink" xmlns:am3d="http://schemas.microsoft.com/office/drawing/2017/model3d" xmlns:o="urn:schemas-microsoft-com:office:office" xmlns:oel="http://schemas.microsoft.com/office/2019/extlst" xmlns:r="http://schemas.openxmlformats.org/officeDocument/2006/relationships" xmlns:m="http://schemas.openxmlformats.org/officeDocument/2006/math" xmlns:v="urn:schemas-microsoft-com:vml" xmlns:wp14="http://schemas.microsoft.com/office/word/2010/wordprocessingDrawing" xmlns:wp="http://schemas.openxmlformats.org/drawingml/2006/wordprocessingDrawing" xmlns:w10="urn:schemas-microsoft-com:office:word" xmlns:w="http://schemas.openxmlformats.org/wordprocessingml/2006/main" xmlns:w14="http://schemas.microsoft.com/office/word/2010/wordml" xmlns:w15="http://schemas.microsoft.com/office/word/2012/wordml" xmlns:w16cex="http://schemas.microsoft.com/office/word/2018/wordml/cex" xmlns:w16cid="http://schemas.microsoft.com/office/word/2016/wordml/cid" xmlns:w16="http://schemas.microsoft.com/office/word/2018/wordml" xmlns:w16du="http://schemas.microsoft.com/office/word/2023/wordml/word16du" xmlns:w16sdtdh="http://schemas.microsoft.com/office/word/2020/wordml/sdtdatahash" xmlns:w16sdtfl="http://schemas.microsoft.com/office/word/2024/wordml/sdtformatlock" xmlns:w16se="http://schemas.microsoft.com/office/word/2015/wordml/symex" xmlns:wpg="http://schemas.microsoft.com/office/word/2010/wordprocessingGroup" xmlns:wpi="http://schemas.microsoft.com/office/word/2010/wordprocessingInk" xmlns:wne="http://schemas.microsoft.com/office/word/2006/wordml" xmlns:wps="http://schemas.microsoft.com/office/word/2010/wordprocessingShape" mc:Ignorable="w14 w15 w16se w16cid w16 w16cex w16sdtdh w16sdtfl w16du wp14">
   <w:abstractNum w:abstractNumId="0" w15:restartNumberingAfterBreak="0">
     <w:nsid w:val="29572F4F"/>
     <w:multiLevelType w:val="hybridMultilevel"/>
@@ -1844,23 +1654,23 @@
       </w:rPr>
     </w:lvl>
   </w:abstractNum>
-  <w:num w:numId="1">
+  <w:num w:numId="1" w16cid:durableId="310210330">
     <w:abstractNumId w:val="2"/>
   </w:num>
-  <w:num w:numId="2">
+  <w:num w:numId="2" w16cid:durableId="324936668">
     <w:abstractNumId w:val="0"/>
   </w:num>
-  <w:num w:numId="3">
+  <w:num w:numId="3" w16cid:durableId="970289567">
     <w:abstractNumId w:val="3"/>
   </w:num>
-  <w:num w:numId="4">
+  <w:num w:numId="4" w16cid:durableId="470178267">
     <w:abstractNumId w:val="1"/>
   </w:num>
 </w:numbering>
 </file>
 
 <file path=word/styles.xml><?xml version="1.0" encoding="utf-8"?>
-<w:styles xmlns:mc="http://schemas.openxmlformats.org/markup-compatibility/2006" xmlns:r="http://schemas.openxmlformats.org/officeDocument/2006/relationships" xmlns:w="http://schemas.openxmlformats.org/wordprocessingml/2006/main" xmlns:w14="http://schemas.microsoft.com/office/word/2010/wordml" xmlns:w15="http://schemas.microsoft.com/office/word/2012/wordml" xmlns:w16cex="http://schemas.microsoft.com/office/word/2018/wordml/cex" xmlns:w16cid="http://schemas.microsoft.com/office/word/2016/wordml/cid" xmlns:w16="http://schemas.microsoft.com/office/word/2018/wordml" xmlns:w16sdtdh="http://schemas.microsoft.com/office/word/2020/wordml/sdtdatahash" xmlns:w16se="http://schemas.microsoft.com/office/word/2015/wordml/symex" mc:Ignorable="w14 w15 w16se w16cid w16 w16cex w16sdtdh">
+<w:styles xmlns:mc="http://schemas.openxmlformats.org/markup-compatibility/2006" xmlns:r="http://schemas.openxmlformats.org/officeDocument/2006/relationships" xmlns:w="http://schemas.openxmlformats.org/wordprocessingml/2006/main" xmlns:w14="http://schemas.microsoft.com/office/word/2010/wordml" xmlns:w15="http://schemas.microsoft.com/office/word/2012/wordml" xmlns:w16cex="http://schemas.microsoft.com/office/word/2018/wordml/cex" xmlns:w16cid="http://schemas.microsoft.com/office/word/2016/wordml/cid" xmlns:w16="http://schemas.microsoft.com/office/word/2018/wordml" xmlns:w16du="http://schemas.microsoft.com/office/word/2023/wordml/word16du" xmlns:w16sdtdh="http://schemas.microsoft.com/office/word/2020/wordml/sdtdatahash" xmlns:w16sdtfl="http://schemas.microsoft.com/office/word/2024/wordml/sdtformatlock" xmlns:w16se="http://schemas.microsoft.com/office/word/2015/wordml/symex" mc:Ignorable="w14 w15 w16se w16cid w16 w16cex w16sdtdh w16sdtfl w16du">
   <w:docDefaults>
     <w:rPrDefault>
       <w:rPr>

</xml_diff>